<commit_message>
refactor: clean templates directory, simplify caption format, and add hyperlink target URL sync and audit
</commit_message>
<xml_diff>
--- a/20260906/DOC範本/VN20260906_01_越南新身分法.docx
+++ b/20260906/DOC範本/VN20260906_01_越南新身分法.docx
@@ -1481,7 +1481,7 @@
                 <w:rtl w:val="0"/>
                 <w:color w:val="000000"/>
               </w:rPr>
-              <w:t xml:space="preserve">{Thẻ căn cước công dân gắn chíp điện tử cho người Việt Nam định cư ở nước ngoài(Ảnh envato/vietnam_id_card)}</w:t>
+              <w:t xml:space="preserve">主圖說明(Ảnh envato/vietnam_id_card)</w:t>
             </w:r>
             <w:r>
               <w:rPr>
@@ -1909,13 +1909,12 @@
               <w:rPr>
                 <w:rFonts w:ascii="Times New Roman" w:cs="Times New Roman" w:eastAsia="Times New Roman" w:hAnsi="Times New Roman"/>
                 <w:rtl w:val="0"/>
-                <w:color w:val="000000"/>
-              </w:rPr>
-            </w:r>
-            <w:r>
-              <w:rPr>
-                <w:rtl w:val="0"/>
-                <w:color w:val="000000"/>
+              </w:rPr>
+              <w:t xml:space="preserve"> </w:t>
+            </w:r>
+            <w:r>
+              <w:rPr>
+                <w:rtl w:val="0"/>
               </w:rPr>
             </w:r>
           </w:p>

</xml_diff>